<commit_message>
Made minor changes to Asm, C, Comp, Linux
</commit_message>
<xml_diff>
--- a/Assembly.docx
+++ b/Assembly.docx
@@ -867,6 +867,89 @@
         <w:t xml:space="preserve">The segment registers wont make too much sense unless we discuss how memory is segmented. It is the responsibility of the assembler to segment memory, but there are specific convensions as to how memory is segmented. Each segment contains a specific kind of data. For example, the .data segment contains global and static variables, the .text segment contains our actual code, and the .bss (block starting symbol) segment contains local variables. </w:t>
       </w:r>
     </w:p>
+    <w:p>
+      <w:pPr>
+        <w:pStyle w:val="Normal"/>
+        <w:spacing w:before="0" w:after="160"/>
+        <w:rPr>
+          <w:u w:val="single"/>
+        </w:rPr>
+      </w:pPr>
+      <w:r>
+        <w:rPr>
+          <w:u w:val="single"/>
+        </w:rPr>
+      </w:r>
+    </w:p>
+    <w:p>
+      <w:pPr>
+        <w:pStyle w:val="Normal"/>
+        <w:spacing w:before="0" w:after="160"/>
+        <w:rPr>
+          <w:u w:val="none"/>
+        </w:rPr>
+      </w:pPr>
+      <w:r>
+        <w:rPr>
+          <w:u w:val="single"/>
+        </w:rPr>
+        <w:t>Extensible Linker Format (ELF):</w:t>
+      </w:r>
+    </w:p>
+    <w:p>
+      <w:pPr>
+        <w:pStyle w:val="Normal"/>
+        <w:spacing w:before="0" w:after="160"/>
+        <w:rPr>
+          <w:u w:val="none"/>
+        </w:rPr>
+      </w:pPr>
+      <w:r>
+        <w:rPr/>
+      </w:r>
+    </w:p>
+    <w:p>
+      <w:pPr>
+        <w:pStyle w:val="Normal"/>
+        <w:spacing w:before="0" w:after="160"/>
+        <w:rPr>
+          <w:u w:val="none"/>
+        </w:rPr>
+      </w:pPr>
+      <w:r>
+        <w:rPr>
+          <w:u w:val="single"/>
+        </w:rPr>
+        <w:t>GDTR, LDTR, IDTR Registers:</w:t>
+      </w:r>
+    </w:p>
+    <w:p>
+      <w:pPr>
+        <w:pStyle w:val="Normal"/>
+        <w:spacing w:before="0" w:after="160"/>
+        <w:rPr>
+          <w:u w:val="none"/>
+        </w:rPr>
+      </w:pPr>
+      <w:r>
+        <w:rPr/>
+      </w:r>
+    </w:p>
+    <w:p>
+      <w:pPr>
+        <w:pStyle w:val="Normal"/>
+        <w:spacing w:before="0" w:after="160"/>
+        <w:rPr>
+          <w:u w:val="none"/>
+        </w:rPr>
+      </w:pPr>
+      <w:r>
+        <w:rPr>
+          <w:u w:val="single"/>
+        </w:rPr>
+        <w:t>x86 Ports vs ARM I/O:</w:t>
+      </w:r>
+    </w:p>
     <w:sectPr>
       <w:headerReference w:type="default" r:id="rId3"/>
       <w:footerReference w:type="default" r:id="rId4"/>

</xml_diff>